<commit_message>
docs:Modf project screenshots documentation
</commit_message>
<xml_diff>
--- a/screan.docx
+++ b/screan.docx
@@ -2,6 +2,13 @@
 <file path=word/document.xml><?xml version="1.0" encoding="utf-8"?>
 <w:document xmlns:wpc="http://schemas.microsoft.com/office/word/2010/wordprocessingCanvas" xmlns:cx="http://schemas.microsoft.com/office/drawing/2014/chartex" xmlns:cx1="http://schemas.microsoft.com/office/drawing/2015/9/8/chartex" xmlns:cx2="http://schemas.microsoft.com/office/drawing/2015/10/21/chartex" xmlns:cx3="http://schemas.microsoft.com/office/drawing/2016/5/9/chartex" xmlns:cx4="http://schemas.microsoft.com/office/drawing/2016/5/10/chartex" xmlns:cx5="http://schemas.microsoft.com/office/drawing/2016/5/11/chartex" xmlns:cx6="http://schemas.microsoft.com/office/drawing/2016/5/12/chartex" xmlns:cx7="http://schemas.microsoft.com/office/drawing/2016/5/13/chartex" xmlns:cx8="http://schemas.microsoft.com/office/drawing/2016/5/14/chartex" xmlns:mc="http://schemas.openxmlformats.org/markup-compatibility/2006" xmlns:aink="http://schemas.microsoft.com/office/drawing/2016/ink" xmlns:am3d="http://schemas.microsoft.com/office/drawing/2017/model3d" xmlns:o="urn:schemas-microsoft-com:office:office" xmlns:r="http://schemas.openxmlformats.org/officeDocument/2006/relationships" xmlns:m="http://schemas.openxmlformats.org/officeDocument/2006/math" xmlns:v="urn:schemas-microsoft-com:vml" xmlns:wp14="http://schemas.microsoft.com/office/word/2010/wordprocessingDrawing" xmlns:wp="http://schemas.openxmlformats.org/drawingml/2006/wordprocessingDrawing" xmlns:w10="urn:schemas-microsoft-com:office:word" xmlns:w="http://schemas.openxmlformats.org/wordprocessingml/2006/main" xmlns:w14="http://schemas.microsoft.com/office/word/2010/wordml" xmlns:w15="http://schemas.microsoft.com/office/word/2012/wordml" xmlns:w16cex="http://schemas.microsoft.com/office/word/2018/wordml/cex" xmlns:w16cid="http://schemas.microsoft.com/office/word/2016/wordml/cid" xmlns:w16="http://schemas.microsoft.com/office/word/2018/wordml" xmlns:w16sdtdh="http://schemas.microsoft.com/office/word/2020/wordml/sdtdatahash" xmlns:w16se="http://schemas.microsoft.com/office/word/2015/wordml/symex" xmlns:wpg="http://schemas.microsoft.com/office/word/2010/wordprocessingGroup" xmlns:wpi="http://schemas.microsoft.com/office/word/2010/wordprocessingInk" xmlns:wne="http://schemas.microsoft.com/office/word/2006/wordml" xmlns:wps="http://schemas.microsoft.com/office/word/2010/wordprocessingShape" mc:Ignorable="w14 w15 w16se w16cid w16 w16cex w16sdtdh wp14">
   <w:body>
+    <w:p>
+      <w:pPr>
+        <w:rPr>
+          <w:lang w:bidi="ar-YE"/>
+        </w:rPr>
+      </w:pPr>
+    </w:p>
     <w:p>
       <w:pPr>
         <w:rPr>
@@ -25,93 +32,6 @@
             <wp:extent cx="5943600" cy="3343275"/>
             <wp:effectExtent l="0" t="0" r="0" b="9525"/>
             <wp:docPr id="1" name="صورة 1"/>
-            <wp:cNvGraphicFramePr>
-              <a:graphicFrameLocks xmlns:a="http://schemas.openxmlformats.org/drawingml/2006/main" noChangeAspect="1"/>
-            </wp:cNvGraphicFramePr>
-            <a:graphic xmlns:a="http://schemas.openxmlformats.org/drawingml/2006/main">
-              <a:graphicData uri="http://schemas.openxmlformats.org/drawingml/2006/picture">
-                <pic:pic xmlns:pic="http://schemas.openxmlformats.org/drawingml/2006/picture">
-                  <pic:nvPicPr>
-                    <pic:cNvPr id="1" name=""/>
-                    <pic:cNvPicPr/>
-                  </pic:nvPicPr>
-                  <pic:blipFill>
-                    <a:blip r:embed="rId6"/>
-                    <a:stretch>
-                      <a:fillRect/>
-                    </a:stretch>
-                  </pic:blipFill>
-                  <pic:spPr>
-                    <a:xfrm>
-                      <a:off x="0" y="0"/>
-                      <a:ext cx="5943600" cy="3343275"/>
-                    </a:xfrm>
-                    <a:prstGeom prst="rect">
-                      <a:avLst/>
-                    </a:prstGeom>
-                  </pic:spPr>
-                </pic:pic>
-              </a:graphicData>
-            </a:graphic>
-          </wp:inline>
-        </w:drawing>
-      </w:r>
-    </w:p>
-    <w:p>
-      <w:pPr>
-        <w:bidi/>
-        <w:jc w:val="center"/>
-      </w:pPr>
-      <w:r>
-        <w:rPr>
-          <w:rFonts w:hint="cs"/>
-          <w:rtl/>
-          <w:lang w:bidi="ar-YE"/>
-        </w:rPr>
-        <w:t xml:space="preserve">2- كود ملف  </w:t>
-      </w:r>
-      <w:r>
-        <w:t>io.py</w:t>
-      </w:r>
-      <w:r>
-        <w:rPr>
-          <w:rFonts w:hint="cs"/>
-          <w:rtl/>
-        </w:rPr>
-        <w:t xml:space="preserve"> </w:t>
-      </w:r>
-      <w:r>
-        <w:t xml:space="preserve"> </w:t>
-      </w:r>
-      <w:r>
-        <w:rPr>
-          <w:rFonts w:hint="cs"/>
-          <w:rtl/>
-          <w:lang w:bidi="ar-YE"/>
-        </w:rPr>
-        <w:t xml:space="preserve">مسول عن ملفات الادخال والإخراج يقراء بيانات المبيعات ويحفظ البيانات الناتجه من ملفات </w:t>
-      </w:r>
-      <w:r>
-        <w:t>CSV</w:t>
-      </w:r>
-    </w:p>
-    <w:p>
-      <w:pPr>
-        <w:bidi/>
-        <w:jc w:val="center"/>
-        <w:rPr>
-          <w:noProof/>
-        </w:rPr>
-      </w:pPr>
-      <w:r>
-        <w:rPr>
-          <w:noProof/>
-        </w:rPr>
-        <w:drawing>
-          <wp:inline distT="0" distB="0" distL="0" distR="0" wp14:anchorId="45202DB0" wp14:editId="7F7DDA5E">
-            <wp:extent cx="5943600" cy="3343275"/>
-            <wp:effectExtent l="0" t="0" r="0" b="9525"/>
-            <wp:docPr id="3" name="صورة 3"/>
             <wp:cNvGraphicFramePr>
               <a:graphicFrameLocks xmlns:a="http://schemas.openxmlformats.org/drawingml/2006/main" noChangeAspect="1"/>
             </wp:cNvGraphicFramePr>
@@ -146,45 +66,59 @@
     </w:p>
     <w:p>
       <w:pPr>
-        <w:tabs>
-          <w:tab w:val="left" w:pos="8229"/>
-        </w:tabs>
-        <w:bidi/>
-        <w:rPr>
-          <w:rtl/>
-        </w:rPr>
+        <w:bidi/>
+        <w:jc w:val="center"/>
       </w:pPr>
       <w:r>
         <w:rPr>
           <w:rFonts w:hint="cs"/>
           <w:rtl/>
-        </w:rPr>
-        <w:t xml:space="preserve">3-لقطه لاامر التهيئه وانشاء مجلد </w:t>
-      </w:r>
-      <w:r>
-        <w:t xml:space="preserve">gitignore </w:t>
-      </w:r>
-    </w:p>
-    <w:p>
-      <w:pPr>
-        <w:tabs>
-          <w:tab w:val="left" w:pos="8229"/>
-        </w:tabs>
-        <w:bidi/>
-        <w:rPr>
-          <w:rtl/>
-        </w:rPr>
-      </w:pPr>
-      <w:r>
-        <w:rPr>
-          <w:noProof/>
-        </w:rPr>
-        <w:lastRenderedPageBreak/>
+          <w:lang w:bidi="ar-YE"/>
+        </w:rPr>
+        <w:t xml:space="preserve">2- كود ملف  </w:t>
+      </w:r>
+      <w:r>
+        <w:t>io.py</w:t>
+      </w:r>
+      <w:r>
+        <w:rPr>
+          <w:rFonts w:hint="cs"/>
+          <w:rtl/>
+        </w:rPr>
+        <w:t xml:space="preserve"> </w:t>
+      </w:r>
+      <w:r>
+        <w:t xml:space="preserve"> </w:t>
+      </w:r>
+      <w:r>
+        <w:rPr>
+          <w:rFonts w:hint="cs"/>
+          <w:rtl/>
+          <w:lang w:bidi="ar-YE"/>
+        </w:rPr>
+        <w:t xml:space="preserve">مسول عن ملفات الادخال والإخراج يقراء بيانات المبيعات ويحفظ البيانات الناتجه من ملفات </w:t>
+      </w:r>
+      <w:r>
+        <w:t>CSV</w:t>
+      </w:r>
+    </w:p>
+    <w:p>
+      <w:pPr>
+        <w:bidi/>
+        <w:jc w:val="center"/>
+        <w:rPr>
+          <w:noProof/>
+        </w:rPr>
+      </w:pPr>
+      <w:r>
+        <w:rPr>
+          <w:noProof/>
+        </w:rPr>
         <w:drawing>
-          <wp:inline distT="0" distB="0" distL="0" distR="0" wp14:anchorId="1D0BC472" wp14:editId="5EE47BE3">
+          <wp:inline distT="0" distB="0" distL="0" distR="0" wp14:anchorId="45202DB0" wp14:editId="7F7DDA5E">
             <wp:extent cx="5943600" cy="3343275"/>
             <wp:effectExtent l="0" t="0" r="0" b="9525"/>
-            <wp:docPr id="5" name="صورة 5"/>
+            <wp:docPr id="3" name="صورة 3"/>
             <wp:cNvGraphicFramePr>
               <a:graphicFrameLocks xmlns:a="http://schemas.openxmlformats.org/drawingml/2006/main" noChangeAspect="1"/>
             </wp:cNvGraphicFramePr>
@@ -223,16 +157,19 @@
           <w:tab w:val="left" w:pos="8229"/>
         </w:tabs>
         <w:bidi/>
+        <w:rPr>
+          <w:rtl/>
+        </w:rPr>
       </w:pPr>
       <w:r>
         <w:rPr>
           <w:rFonts w:hint="cs"/>
           <w:rtl/>
         </w:rPr>
-        <w:t xml:space="preserve">4- بعد الاضافه وانشاء اول </w:t>
-      </w:r>
-      <w:r>
-        <w:t>commit</w:t>
+        <w:t xml:space="preserve">3-لقطه لاامر التهيئه وانشاء مجلد </w:t>
+      </w:r>
+      <w:r>
+        <w:t xml:space="preserve">gitignore </w:t>
       </w:r>
     </w:p>
     <w:p>
@@ -242,18 +179,19 @@
         </w:tabs>
         <w:bidi/>
         <w:rPr>
-          <w:noProof/>
-        </w:rPr>
-      </w:pPr>
-      <w:r>
-        <w:rPr>
-          <w:noProof/>
-        </w:rPr>
+          <w:rtl/>
+        </w:rPr>
+      </w:pPr>
+      <w:r>
+        <w:rPr>
+          <w:noProof/>
+        </w:rPr>
+        <w:lastRenderedPageBreak/>
         <w:drawing>
-          <wp:inline distT="0" distB="0" distL="0" distR="0" wp14:anchorId="62EA79E4" wp14:editId="2539F1AE">
+          <wp:inline distT="0" distB="0" distL="0" distR="0" wp14:anchorId="1D0BC472" wp14:editId="5EE47BE3">
             <wp:extent cx="5943600" cy="3343275"/>
             <wp:effectExtent l="0" t="0" r="0" b="9525"/>
-            <wp:docPr id="4" name="صورة 4"/>
+            <wp:docPr id="5" name="صورة 5"/>
             <wp:cNvGraphicFramePr>
               <a:graphicFrameLocks xmlns:a="http://schemas.openxmlformats.org/drawingml/2006/main" noChangeAspect="1"/>
             </wp:cNvGraphicFramePr>
@@ -288,36 +226,26 @@
     </w:p>
     <w:p>
       <w:pPr>
-        <w:bidi/>
-        <w:rPr>
-          <w:noProof/>
-        </w:rPr>
-      </w:pPr>
-    </w:p>
-    <w:p>
-      <w:pPr>
         <w:tabs>
-          <w:tab w:val="left" w:pos="3263"/>
+          <w:tab w:val="left" w:pos="8229"/>
         </w:tabs>
         <w:bidi/>
-        <w:rPr>
-          <w:rtl/>
-          <w:lang w:bidi="ar-YE"/>
-        </w:rPr>
       </w:pPr>
       <w:r>
         <w:rPr>
           <w:rFonts w:hint="cs"/>
           <w:rtl/>
-          <w:lang w:bidi="ar-YE"/>
-        </w:rPr>
-        <w:t>5- لقطة توثق تنفيذ الاختبارات</w:t>
+        </w:rPr>
+        <w:t xml:space="preserve">4- بعد الاضافه وانشاء اول </w:t>
+      </w:r>
+      <w:r>
+        <w:t>commit</w:t>
       </w:r>
     </w:p>
     <w:p>
       <w:pPr>
         <w:tabs>
-          <w:tab w:val="left" w:pos="3263"/>
+          <w:tab w:val="left" w:pos="8229"/>
         </w:tabs>
         <w:bidi/>
         <w:rPr>
@@ -328,12 +256,11 @@
         <w:rPr>
           <w:noProof/>
         </w:rPr>
-        <w:lastRenderedPageBreak/>
         <w:drawing>
-          <wp:inline distT="0" distB="0" distL="0" distR="0" wp14:anchorId="4E95BAB0" wp14:editId="310BC6DB">
+          <wp:inline distT="0" distB="0" distL="0" distR="0" wp14:anchorId="62EA79E4" wp14:editId="2539F1AE">
             <wp:extent cx="5943600" cy="3343275"/>
             <wp:effectExtent l="0" t="0" r="0" b="9525"/>
-            <wp:docPr id="6" name="صورة 6"/>
+            <wp:docPr id="4" name="صورة 4"/>
             <wp:cNvGraphicFramePr>
               <a:graphicFrameLocks xmlns:a="http://schemas.openxmlformats.org/drawingml/2006/main" noChangeAspect="1"/>
             </wp:cNvGraphicFramePr>
@@ -368,8 +295,16 @@
     </w:p>
     <w:p>
       <w:pPr>
+        <w:bidi/>
+        <w:rPr>
+          <w:noProof/>
+        </w:rPr>
+      </w:pPr>
+    </w:p>
+    <w:p>
+      <w:pPr>
         <w:tabs>
-          <w:tab w:val="left" w:pos="5395"/>
+          <w:tab w:val="left" w:pos="3263"/>
         </w:tabs>
         <w:bidi/>
         <w:rPr>
@@ -379,71 +314,33 @@
       </w:pPr>
       <w:r>
         <w:rPr>
-          <w:rtl/>
-          <w:lang w:bidi="ar-YE"/>
-        </w:rPr>
-        <w:tab/>
+          <w:rFonts w:hint="cs"/>
+          <w:rtl/>
+          <w:lang w:bidi="ar-YE"/>
+        </w:rPr>
+        <w:t>5- لقطة توثق تنفيذ الاختبارات</w:t>
       </w:r>
     </w:p>
     <w:p>
       <w:pPr>
         <w:tabs>
-          <w:tab w:val="left" w:pos="5395"/>
+          <w:tab w:val="left" w:pos="3263"/>
         </w:tabs>
         <w:bidi/>
         <w:rPr>
-          <w:rtl/>
-          <w:lang w:bidi="ar-YE"/>
-        </w:rPr>
-      </w:pPr>
-      <w:r>
-        <w:rPr>
-          <w:rFonts w:hint="cs"/>
-          <w:rtl/>
-          <w:lang w:bidi="ar-YE"/>
-        </w:rPr>
-        <w:t>6-</w:t>
-      </w:r>
-      <w:r>
-        <w:rPr>
-          <w:rFonts w:hint="cs"/>
-          <w:rtl/>
-          <w:lang w:bidi="ar-YE"/>
-        </w:rPr>
-        <w:t xml:space="preserve">لقطة توثق </w:t>
-      </w:r>
-      <w:r>
-        <w:t xml:space="preserve">commit </w:t>
-      </w:r>
-      <w:r>
-        <w:rPr>
-          <w:rFonts w:hint="cs"/>
-          <w:rtl/>
-          <w:lang w:bidi="ar-YE"/>
-        </w:rPr>
-        <w:t>الخاصه بالاختبارات</w:t>
-      </w:r>
-    </w:p>
-    <w:p>
-      <w:pPr>
-        <w:tabs>
-          <w:tab w:val="left" w:pos="5395"/>
-        </w:tabs>
-        <w:bidi/>
-        <w:rPr>
-          <w:rtl/>
-          <w:lang w:bidi="ar-YE"/>
-        </w:rPr>
-      </w:pPr>
-      <w:r>
-        <w:rPr>
-          <w:noProof/>
-        </w:rPr>
+          <w:noProof/>
+        </w:rPr>
+      </w:pPr>
+      <w:r>
+        <w:rPr>
+          <w:noProof/>
+        </w:rPr>
+        <w:lastRenderedPageBreak/>
         <w:drawing>
-          <wp:inline distT="0" distB="0" distL="0" distR="0" wp14:anchorId="3A309A68" wp14:editId="48C30299">
+          <wp:inline distT="0" distB="0" distL="0" distR="0" wp14:anchorId="4E95BAB0" wp14:editId="310BC6DB">
             <wp:extent cx="5943600" cy="3343275"/>
             <wp:effectExtent l="0" t="0" r="0" b="9525"/>
-            <wp:docPr id="8" name="صورة 8"/>
+            <wp:docPr id="6" name="صورة 6"/>
             <wp:cNvGraphicFramePr>
               <a:graphicFrameLocks xmlns:a="http://schemas.openxmlformats.org/drawingml/2006/main" noChangeAspect="1"/>
             </wp:cNvGraphicFramePr>
@@ -475,13 +372,6 @@
           </wp:inline>
         </w:drawing>
       </w:r>
-      <w:r>
-        <w:rPr>
-          <w:rtl/>
-          <w:lang w:bidi="ar-YE"/>
-        </w:rPr>
-        <w:tab/>
-      </w:r>
     </w:p>
     <w:p>
       <w:pPr>
@@ -496,19 +386,10 @@
       </w:pPr>
       <w:r>
         <w:rPr>
-          <w:rFonts w:hint="cs"/>
-          <w:rtl/>
-          <w:lang w:bidi="ar-YE"/>
-        </w:rPr>
-        <w:t>7-</w:t>
-      </w:r>
-      <w:r>
-        <w:rPr>
-          <w:rFonts w:hint="cs"/>
-          <w:rtl/>
-          <w:lang w:bidi="ar-YE"/>
-        </w:rPr>
-        <w:t xml:space="preserve"> انشاء فرع والتاكد منه وتحقق من تاريخ الفرع</w:t>
+          <w:rtl/>
+          <w:lang w:bidi="ar-YE"/>
+        </w:rPr>
+        <w:tab/>
       </w:r>
     </w:p>
     <w:p>
@@ -518,19 +399,58 @@
         </w:tabs>
         <w:bidi/>
         <w:rPr>
-          <w:noProof/>
-        </w:rPr>
-      </w:pPr>
-      <w:r>
-        <w:rPr>
-          <w:noProof/>
-        </w:rPr>
-        <w:lastRenderedPageBreak/>
+          <w:rtl/>
+          <w:lang w:bidi="ar-YE"/>
+        </w:rPr>
+      </w:pPr>
+      <w:r>
+        <w:rPr>
+          <w:rFonts w:hint="cs"/>
+          <w:rtl/>
+          <w:lang w:bidi="ar-YE"/>
+        </w:rPr>
+        <w:t>6-</w:t>
+      </w:r>
+      <w:r>
+        <w:rPr>
+          <w:rFonts w:hint="cs"/>
+          <w:rtl/>
+          <w:lang w:bidi="ar-YE"/>
+        </w:rPr>
+        <w:t xml:space="preserve">لقطة توثق </w:t>
+      </w:r>
+      <w:r>
+        <w:t xml:space="preserve">commit </w:t>
+      </w:r>
+      <w:r>
+        <w:rPr>
+          <w:rFonts w:hint="cs"/>
+          <w:rtl/>
+          <w:lang w:bidi="ar-YE"/>
+        </w:rPr>
+        <w:t>الخاصه بالاختبارات</w:t>
+      </w:r>
+    </w:p>
+    <w:p>
+      <w:pPr>
+        <w:tabs>
+          <w:tab w:val="left" w:pos="5395"/>
+        </w:tabs>
+        <w:bidi/>
+        <w:rPr>
+          <w:rtl/>
+          <w:lang w:bidi="ar-YE"/>
+        </w:rPr>
+      </w:pPr>
+      <w:r>
+        <w:rPr>
+          <w:noProof/>
+        </w:rPr>
         <w:drawing>
-          <wp:inline distT="0" distB="0" distL="0" distR="0" wp14:anchorId="673CA22A" wp14:editId="76369522">
+          <wp:inline distT="0" distB="0" distL="0" distR="0" wp14:anchorId="3A309A68" wp14:editId="48C30299">
             <wp:extent cx="5943600" cy="3343275"/>
             <wp:effectExtent l="0" t="0" r="0" b="9525"/>
-            <wp:docPr id="9" name="صورة 9"/>
+            <wp:docPr id="8" name="صورة 8"/>
             <wp:cNvGraphicFramePr>
               <a:graphicFrameLocks xmlns:a="http://schemas.openxmlformats.org/drawingml/2006/main" noChangeAspect="1"/>
             </wp:cNvGraphicFramePr>
@@ -562,11 +482,18 @@
           </wp:inline>
         </w:drawing>
       </w:r>
+      <w:r>
+        <w:rPr>
+          <w:rtl/>
+          <w:lang w:bidi="ar-YE"/>
+        </w:rPr>
+        <w:tab/>
+      </w:r>
     </w:p>
     <w:p>
       <w:pPr>
         <w:tabs>
-          <w:tab w:val="left" w:pos="3778"/>
+          <w:tab w:val="left" w:pos="5395"/>
         </w:tabs>
         <w:bidi/>
         <w:rPr>
@@ -576,57 +503,41 @@
       </w:pPr>
       <w:r>
         <w:rPr>
-          <w:rtl/>
-          <w:lang w:bidi="ar-YE"/>
-        </w:rPr>
-        <w:tab/>
+          <w:rFonts w:hint="cs"/>
+          <w:rtl/>
+          <w:lang w:bidi="ar-YE"/>
+        </w:rPr>
+        <w:t>7-</w:t>
+      </w:r>
+      <w:r>
+        <w:rPr>
+          <w:rFonts w:hint="cs"/>
+          <w:rtl/>
+          <w:lang w:bidi="ar-YE"/>
+        </w:rPr>
+        <w:t xml:space="preserve"> انشاء فرع والتاكد منه وتحقق من تاريخ الفرع</w:t>
       </w:r>
     </w:p>
     <w:p>
       <w:pPr>
         <w:tabs>
-          <w:tab w:val="left" w:pos="3778"/>
+          <w:tab w:val="left" w:pos="5395"/>
         </w:tabs>
         <w:bidi/>
         <w:rPr>
-          <w:lang w:bidi="ar-YE"/>
-        </w:rPr>
-      </w:pPr>
-      <w:r>
-        <w:rPr>
-          <w:rFonts w:hint="cs"/>
-          <w:rtl/>
-          <w:lang w:bidi="ar-YE"/>
-        </w:rPr>
-        <w:t>8-</w:t>
-      </w:r>
-      <w:r>
-        <w:rPr>
-          <w:lang w:bidi="ar-YE"/>
-        </w:rPr>
-        <w:t>git stging</w:t>
-      </w:r>
-    </w:p>
-    <w:p>
-      <w:pPr>
-        <w:tabs>
-          <w:tab w:val="left" w:pos="3778"/>
-        </w:tabs>
-        <w:bidi/>
-        <w:rPr>
-          <w:rtl/>
-          <w:lang w:bidi="ar-YE"/>
-        </w:rPr>
-      </w:pPr>
-      <w:r>
-        <w:rPr>
-          <w:noProof/>
-        </w:rPr>
+          <w:noProof/>
+        </w:rPr>
+      </w:pPr>
+      <w:r>
+        <w:rPr>
+          <w:noProof/>
+        </w:rPr>
+        <w:lastRenderedPageBreak/>
         <w:drawing>
-          <wp:inline distT="0" distB="0" distL="0" distR="0" wp14:anchorId="334B2432" wp14:editId="13814268">
+          <wp:inline distT="0" distB="0" distL="0" distR="0" wp14:anchorId="673CA22A" wp14:editId="76369522">
             <wp:extent cx="5943600" cy="3343275"/>
             <wp:effectExtent l="0" t="0" r="0" b="9525"/>
-            <wp:docPr id="11" name="صورة 11"/>
+            <wp:docPr id="9" name="صورة 9"/>
             <wp:cNvGraphicFramePr>
               <a:graphicFrameLocks xmlns:a="http://schemas.openxmlformats.org/drawingml/2006/main" noChangeAspect="1"/>
             </wp:cNvGraphicFramePr>
@@ -662,10 +573,11 @@
     <w:p>
       <w:pPr>
         <w:tabs>
-          <w:tab w:val="left" w:pos="5367"/>
+          <w:tab w:val="left" w:pos="3778"/>
         </w:tabs>
         <w:bidi/>
         <w:rPr>
+          <w:rtl/>
           <w:lang w:bidi="ar-YE"/>
         </w:rPr>
       </w:pPr>
@@ -680,43 +592,48 @@
     <w:p>
       <w:pPr>
         <w:tabs>
-          <w:tab w:val="left" w:pos="5367"/>
+          <w:tab w:val="left" w:pos="3778"/>
         </w:tabs>
         <w:bidi/>
-      </w:pPr>
-      <w:r>
-        <w:rPr>
-          <w:lang w:bidi="ar-YE"/>
-        </w:rPr>
-        <w:t>9-</w:t>
-      </w:r>
-      <w:r>
-        <w:rPr>
-          <w:lang w:bidi="ar-YE"/>
-        </w:rPr>
-        <w:t xml:space="preserve"> </w:t>
-      </w:r>
-      <w:r>
-        <w:t>Agent</w:t>
+        <w:rPr>
+          <w:lang w:bidi="ar-YE"/>
+        </w:rPr>
+      </w:pPr>
+      <w:r>
+        <w:rPr>
+          <w:rFonts w:hint="cs"/>
+          <w:rtl/>
+          <w:lang w:bidi="ar-YE"/>
+        </w:rPr>
+        <w:t>8-</w:t>
+      </w:r>
+      <w:r>
+        <w:rPr>
+          <w:lang w:bidi="ar-YE"/>
+        </w:rPr>
+        <w:t>git stging</w:t>
       </w:r>
     </w:p>
     <w:p>
       <w:pPr>
         <w:tabs>
-          <w:tab w:val="left" w:pos="5367"/>
+          <w:tab w:val="left" w:pos="3778"/>
         </w:tabs>
         <w:bidi/>
-      </w:pPr>
-      <w:r>
-        <w:rPr>
-          <w:noProof/>
-        </w:rPr>
-        <w:lastRenderedPageBreak/>
+        <w:rPr>
+          <w:rtl/>
+          <w:lang w:bidi="ar-YE"/>
+        </w:rPr>
+      </w:pPr>
+      <w:r>
+        <w:rPr>
+          <w:noProof/>
+        </w:rPr>
         <w:drawing>
-          <wp:inline distT="0" distB="0" distL="0" distR="0" wp14:anchorId="4C53B81A" wp14:editId="0ACA8862">
+          <wp:inline distT="0" distB="0" distL="0" distR="0" wp14:anchorId="334B2432" wp14:editId="13814268">
             <wp:extent cx="5943600" cy="3343275"/>
             <wp:effectExtent l="0" t="0" r="0" b="9525"/>
-            <wp:docPr id="13" name="صورة 13"/>
+            <wp:docPr id="11" name="صورة 11"/>
             <wp:cNvGraphicFramePr>
               <a:graphicFrameLocks xmlns:a="http://schemas.openxmlformats.org/drawingml/2006/main" noChangeAspect="1"/>
             </wp:cNvGraphicFramePr>
@@ -756,18 +673,57 @@
         </w:tabs>
         <w:bidi/>
         <w:rPr>
-          <w:noProof/>
-        </w:rPr>
-      </w:pPr>
-      <w:r>
-        <w:rPr>
-          <w:noProof/>
-        </w:rPr>
+          <w:lang w:bidi="ar-YE"/>
+        </w:rPr>
+      </w:pPr>
+      <w:r>
+        <w:rPr>
+          <w:rtl/>
+          <w:lang w:bidi="ar-YE"/>
+        </w:rPr>
+        <w:tab/>
+      </w:r>
+    </w:p>
+    <w:p>
+      <w:pPr>
+        <w:tabs>
+          <w:tab w:val="left" w:pos="5367"/>
+        </w:tabs>
+        <w:bidi/>
+      </w:pPr>
+      <w:r>
+        <w:rPr>
+          <w:lang w:bidi="ar-YE"/>
+        </w:rPr>
+        <w:t>9-</w:t>
+      </w:r>
+      <w:r>
+        <w:rPr>
+          <w:lang w:bidi="ar-YE"/>
+        </w:rPr>
+        <w:t xml:space="preserve"> </w:t>
+      </w:r>
+      <w:r>
+        <w:t>Agent</w:t>
+      </w:r>
+    </w:p>
+    <w:p>
+      <w:pPr>
+        <w:tabs>
+          <w:tab w:val="left" w:pos="5367"/>
+        </w:tabs>
+        <w:bidi/>
+      </w:pPr>
+      <w:r>
+        <w:rPr>
+          <w:noProof/>
+        </w:rPr>
+        <w:lastRenderedPageBreak/>
         <w:drawing>
-          <wp:inline distT="0" distB="0" distL="0" distR="0" wp14:anchorId="7E889340" wp14:editId="2BF3887E">
+          <wp:inline distT="0" distB="0" distL="0" distR="0" wp14:anchorId="4C53B81A" wp14:editId="0ACA8862">
             <wp:extent cx="5943600" cy="3343275"/>
             <wp:effectExtent l="0" t="0" r="0" b="9525"/>
-            <wp:docPr id="14" name="صورة 14"/>
+            <wp:docPr id="13" name="صورة 13"/>
             <wp:cNvGraphicFramePr>
               <a:graphicFrameLocks xmlns:a="http://schemas.openxmlformats.org/drawingml/2006/main" noChangeAspect="1"/>
             </wp:cNvGraphicFramePr>
@@ -803,7 +759,7 @@
     <w:p>
       <w:pPr>
         <w:tabs>
-          <w:tab w:val="left" w:pos="5882"/>
+          <w:tab w:val="left" w:pos="5367"/>
         </w:tabs>
         <w:bidi/>
         <w:rPr>
@@ -812,20 +768,13 @@
       </w:pPr>
       <w:r>
         <w:rPr>
-          <w:rtl/>
-        </w:rPr>
-        <w:lastRenderedPageBreak/>
-        <w:tab/>
-      </w:r>
-      <w:r>
-        <w:rPr>
           <w:noProof/>
         </w:rPr>
         <w:drawing>
-          <wp:inline distT="0" distB="0" distL="0" distR="0" wp14:anchorId="25024296" wp14:editId="6E8275BA">
+          <wp:inline distT="0" distB="0" distL="0" distR="0" wp14:anchorId="7E889340" wp14:editId="2BF3887E">
             <wp:extent cx="5943600" cy="3343275"/>
             <wp:effectExtent l="0" t="0" r="0" b="9525"/>
-            <wp:docPr id="15" name="صورة 15"/>
+            <wp:docPr id="14" name="صورة 14"/>
             <wp:cNvGraphicFramePr>
               <a:graphicFrameLocks xmlns:a="http://schemas.openxmlformats.org/drawingml/2006/main" noChangeAspect="1"/>
             </wp:cNvGraphicFramePr>
@@ -860,21 +809,30 @@
     </w:p>
     <w:p>
       <w:pPr>
-        <w:bidi/>
-        <w:jc w:val="center"/>
-        <w:rPr>
-          <w:noProof/>
-        </w:rPr>
-      </w:pPr>
+        <w:tabs>
+          <w:tab w:val="left" w:pos="5882"/>
+        </w:tabs>
+        <w:bidi/>
+        <w:rPr>
+          <w:noProof/>
+        </w:rPr>
+      </w:pPr>
+      <w:r>
+        <w:rPr>
+          <w:rtl/>
+        </w:rPr>
+        <w:lastRenderedPageBreak/>
+        <w:tab/>
+      </w:r>
       <w:r>
         <w:rPr>
           <w:noProof/>
         </w:rPr>
         <w:drawing>
-          <wp:inline distT="0" distB="0" distL="0" distR="0" wp14:anchorId="768B081D" wp14:editId="7B944026">
+          <wp:inline distT="0" distB="0" distL="0" distR="0" wp14:anchorId="25024296" wp14:editId="6E8275BA">
             <wp:extent cx="5943600" cy="3343275"/>
             <wp:effectExtent l="0" t="0" r="0" b="9525"/>
-            <wp:docPr id="16" name="صورة 16"/>
+            <wp:docPr id="15" name="صورة 15"/>
             <wp:cNvGraphicFramePr>
               <a:graphicFrameLocks xmlns:a="http://schemas.openxmlformats.org/drawingml/2006/main" noChangeAspect="1"/>
             </wp:cNvGraphicFramePr>
@@ -909,30 +867,21 @@
     </w:p>
     <w:p>
       <w:pPr>
-        <w:tabs>
-          <w:tab w:val="left" w:pos="5685"/>
-        </w:tabs>
-        <w:bidi/>
-        <w:rPr>
-          <w:noProof/>
-        </w:rPr>
-      </w:pPr>
-      <w:r>
-        <w:rPr>
-          <w:rtl/>
-        </w:rPr>
-        <w:lastRenderedPageBreak/>
-        <w:tab/>
-      </w:r>
+        <w:bidi/>
+        <w:jc w:val="center"/>
+        <w:rPr>
+          <w:noProof/>
+        </w:rPr>
+      </w:pPr>
       <w:r>
         <w:rPr>
           <w:noProof/>
         </w:rPr>
         <w:drawing>
-          <wp:inline distT="0" distB="0" distL="0" distR="0" wp14:anchorId="0CA4A2C3" wp14:editId="4E3E4053">
+          <wp:inline distT="0" distB="0" distL="0" distR="0" wp14:anchorId="768B081D" wp14:editId="7B944026">
             <wp:extent cx="5943600" cy="3343275"/>
             <wp:effectExtent l="0" t="0" r="0" b="9525"/>
-            <wp:docPr id="18" name="صورة 18"/>
+            <wp:docPr id="16" name="صورة 16"/>
             <wp:cNvGraphicFramePr>
               <a:graphicFrameLocks xmlns:a="http://schemas.openxmlformats.org/drawingml/2006/main" noChangeAspect="1"/>
             </wp:cNvGraphicFramePr>
@@ -967,50 +916,30 @@
     </w:p>
     <w:p>
       <w:pPr>
-        <w:bidi/>
-        <w:jc w:val="center"/>
-      </w:pPr>
-    </w:p>
-    <w:p>
-      <w:pPr>
-        <w:bidi/>
-        <w:jc w:val="center"/>
-      </w:pPr>
-    </w:p>
-    <w:p>
-      <w:pPr>
-        <w:bidi/>
-        <w:rPr>
-          <w:rtl/>
-          <w:lang w:bidi="ar-YE"/>
-        </w:rPr>
-      </w:pPr>
-      <w:r>
-        <w:rPr>
-          <w:rFonts w:hint="cs"/>
-          <w:rtl/>
-          <w:lang w:bidi="ar-YE"/>
-        </w:rPr>
-        <w:t>10-دمج الفروع</w:t>
-      </w:r>
-    </w:p>
-    <w:p>
-      <w:pPr>
-        <w:bidi/>
-        <w:rPr>
-          <w:rtl/>
-          <w:lang w:bidi="ar-YE"/>
-        </w:rPr>
-      </w:pPr>
+        <w:tabs>
+          <w:tab w:val="left" w:pos="5685"/>
+        </w:tabs>
+        <w:bidi/>
+        <w:rPr>
+          <w:noProof/>
+        </w:rPr>
+      </w:pPr>
+      <w:r>
+        <w:rPr>
+          <w:rtl/>
+        </w:rPr>
+        <w:lastRenderedPageBreak/>
+        <w:tab/>
+      </w:r>
       <w:r>
         <w:rPr>
           <w:noProof/>
         </w:rPr>
         <w:drawing>
-          <wp:inline distT="0" distB="0" distL="0" distR="0" wp14:anchorId="445E951A" wp14:editId="1933BE64">
+          <wp:inline distT="0" distB="0" distL="0" distR="0" wp14:anchorId="0CA4A2C3" wp14:editId="4E3E4053">
             <wp:extent cx="5943600" cy="3343275"/>
             <wp:effectExtent l="0" t="0" r="0" b="9525"/>
-            <wp:docPr id="19" name="صورة 19"/>
+            <wp:docPr id="18" name="صورة 18"/>
             <wp:cNvGraphicFramePr>
               <a:graphicFrameLocks xmlns:a="http://schemas.openxmlformats.org/drawingml/2006/main" noChangeAspect="1"/>
             </wp:cNvGraphicFramePr>
@@ -1046,10 +975,13 @@
     <w:p>
       <w:pPr>
         <w:bidi/>
-        <w:rPr>
-          <w:rtl/>
-          <w:lang w:bidi="ar-YE"/>
-        </w:rPr>
+        <w:jc w:val="center"/>
+      </w:pPr>
+    </w:p>
+    <w:p>
+      <w:pPr>
+        <w:bidi/>
+        <w:jc w:val="center"/>
       </w:pPr>
     </w:p>
     <w:p>
@@ -1066,8 +998,7 @@
           <w:rtl/>
           <w:lang w:bidi="ar-YE"/>
         </w:rPr>
-        <w:lastRenderedPageBreak/>
-        <w:t xml:space="preserve"> 11- انشاء المستودع</w:t>
+        <w:t>10-دمج الفروع</w:t>
       </w:r>
     </w:p>
     <w:p>
@@ -1083,10 +1014,10 @@
           <w:noProof/>
         </w:rPr>
         <w:drawing>
-          <wp:inline distT="0" distB="0" distL="0" distR="0" wp14:anchorId="6DA14751" wp14:editId="370836F9">
+          <wp:inline distT="0" distB="0" distL="0" distR="0" wp14:anchorId="445E951A" wp14:editId="1933BE64">
             <wp:extent cx="5943600" cy="3343275"/>
             <wp:effectExtent l="0" t="0" r="0" b="9525"/>
-            <wp:docPr id="21" name="صورة 21"/>
+            <wp:docPr id="19" name="صورة 19"/>
             <wp:cNvGraphicFramePr>
               <a:graphicFrameLocks xmlns:a="http://schemas.openxmlformats.org/drawingml/2006/main" noChangeAspect="1"/>
             </wp:cNvGraphicFramePr>
@@ -1123,34 +1054,35 @@
       <w:pPr>
         <w:bidi/>
         <w:rPr>
-          <w:noProof/>
-          <w:rtl/>
-        </w:rPr>
-      </w:pPr>
-    </w:p>
-    <w:p>
-      <w:pPr>
-        <w:bidi/>
-        <w:rPr>
-          <w:noProof/>
-          <w:rtl/>
+          <w:rtl/>
+          <w:lang w:bidi="ar-YE"/>
+        </w:rPr>
+      </w:pPr>
+    </w:p>
+    <w:p>
+      <w:pPr>
+        <w:bidi/>
+        <w:rPr>
+          <w:rtl/>
+          <w:lang w:bidi="ar-YE"/>
         </w:rPr>
       </w:pPr>
       <w:r>
         <w:rPr>
           <w:rFonts w:hint="cs"/>
-          <w:noProof/>
-          <w:rtl/>
-        </w:rPr>
-        <w:t>11-ربط المشروع بالمستودع ورفع البيانات</w:t>
-      </w:r>
-    </w:p>
-    <w:p>
-      <w:pPr>
-        <w:bidi/>
-        <w:rPr>
-          <w:noProof/>
-          <w:rtl/>
+          <w:rtl/>
+          <w:lang w:bidi="ar-YE"/>
+        </w:rPr>
+        <w:lastRenderedPageBreak/>
+        <w:t xml:space="preserve"> 11- انشاء المستودع</w:t>
+      </w:r>
+    </w:p>
+    <w:p>
+      <w:pPr>
+        <w:bidi/>
+        <w:rPr>
+          <w:rtl/>
+          <w:lang w:bidi="ar-YE"/>
         </w:rPr>
       </w:pPr>
       <w:r>
@@ -1158,10 +1090,10 @@
           <w:noProof/>
         </w:rPr>
         <w:drawing>
-          <wp:inline distT="0" distB="0" distL="0" distR="0" wp14:anchorId="4C09D0F2" wp14:editId="0BE7BBA7">
+          <wp:inline distT="0" distB="0" distL="0" distR="0" wp14:anchorId="6DA14751" wp14:editId="370836F9">
             <wp:extent cx="5943600" cy="3343275"/>
             <wp:effectExtent l="0" t="0" r="0" b="9525"/>
-            <wp:docPr id="22" name="صورة 22"/>
+            <wp:docPr id="21" name="صورة 21"/>
             <wp:cNvGraphicFramePr>
               <a:graphicFrameLocks xmlns:a="http://schemas.openxmlformats.org/drawingml/2006/main" noChangeAspect="1"/>
             </wp:cNvGraphicFramePr>
@@ -1202,33 +1134,41 @@
           <w:rtl/>
         </w:rPr>
       </w:pPr>
+    </w:p>
+    <w:p>
+      <w:pPr>
+        <w:bidi/>
+        <w:rPr>
+          <w:noProof/>
+          <w:rtl/>
+        </w:rPr>
+      </w:pPr>
       <w:r>
         <w:rPr>
           <w:rFonts w:hint="cs"/>
           <w:noProof/>
           <w:rtl/>
         </w:rPr>
-        <w:t>12- ملفات المشروع بعد الرفع في المستودع</w:t>
-      </w:r>
-    </w:p>
-    <w:p>
-      <w:pPr>
-        <w:bidi/>
-        <w:rPr>
-          <w:noProof/>
-          <w:rtl/>
-        </w:rPr>
-      </w:pPr>
-      <w:r>
-        <w:rPr>
-          <w:noProof/>
-        </w:rPr>
-        <w:lastRenderedPageBreak/>
+        <w:t>11-ربط المشروع بالمستودع ورفع البيانات</w:t>
+      </w:r>
+    </w:p>
+    <w:p>
+      <w:pPr>
+        <w:bidi/>
+        <w:rPr>
+          <w:noProof/>
+          <w:rtl/>
+        </w:rPr>
+      </w:pPr>
+      <w:r>
+        <w:rPr>
+          <w:noProof/>
+        </w:rPr>
         <w:drawing>
-          <wp:inline distT="0" distB="0" distL="0" distR="0" wp14:anchorId="1DAFBC6A" wp14:editId="4A260A36">
+          <wp:inline distT="0" distB="0" distL="0" distR="0" wp14:anchorId="4C09D0F2" wp14:editId="0BE7BBA7">
             <wp:extent cx="5943600" cy="3343275"/>
             <wp:effectExtent l="0" t="0" r="0" b="9525"/>
-            <wp:docPr id="23" name="صورة 23"/>
+            <wp:docPr id="22" name="صورة 22"/>
             <wp:cNvGraphicFramePr>
               <a:graphicFrameLocks xmlns:a="http://schemas.openxmlformats.org/drawingml/2006/main" noChangeAspect="1"/>
             </wp:cNvGraphicFramePr>
@@ -1266,6 +1206,7 @@
         <w:bidi/>
         <w:rPr>
           <w:noProof/>
+          <w:rtl/>
         </w:rPr>
       </w:pPr>
       <w:r>
@@ -1274,39 +1215,27 @@
           <w:noProof/>
           <w:rtl/>
         </w:rPr>
-        <w:t>13-</w:t>
-      </w:r>
-      <w:r>
-        <w:rPr>
-          <w:rFonts w:hint="cs"/>
-          <w:noProof/>
-          <w:rtl/>
-        </w:rPr>
-        <w:t>انشاء ورفع ملف</w:t>
-      </w:r>
-      <w:r>
-        <w:rPr>
-          <w:noProof/>
-        </w:rPr>
-        <w:t>README</w:t>
-      </w:r>
-    </w:p>
-    <w:p>
-      <w:pPr>
-        <w:bidi/>
-        <w:rPr>
-          <w:noProof/>
-        </w:rPr>
-      </w:pPr>
-      <w:r>
-        <w:rPr>
-          <w:noProof/>
-        </w:rPr>
+        <w:t>12- ملفات المشروع بعد الرفع في المستودع</w:t>
+      </w:r>
+    </w:p>
+    <w:p>
+      <w:pPr>
+        <w:bidi/>
+        <w:rPr>
+          <w:noProof/>
+          <w:rtl/>
+        </w:rPr>
+      </w:pPr>
+      <w:r>
+        <w:rPr>
+          <w:noProof/>
+        </w:rPr>
+        <w:lastRenderedPageBreak/>
         <w:drawing>
-          <wp:inline distT="0" distB="0" distL="0" distR="0" wp14:anchorId="7A52303E" wp14:editId="23DFF180">
+          <wp:inline distT="0" distB="0" distL="0" distR="0" wp14:anchorId="1DAFBC6A" wp14:editId="4A260A36">
             <wp:extent cx="5943600" cy="3343275"/>
             <wp:effectExtent l="0" t="0" r="0" b="9525"/>
-            <wp:docPr id="24" name="صورة 24"/>
+            <wp:docPr id="23" name="صورة 23"/>
             <wp:cNvGraphicFramePr>
               <a:graphicFrameLocks xmlns:a="http://schemas.openxmlformats.org/drawingml/2006/main" noChangeAspect="1"/>
             </wp:cNvGraphicFramePr>
@@ -1343,28 +1272,48 @@
       <w:pPr>
         <w:bidi/>
         <w:rPr>
-          <w:rtl/>
-          <w:lang w:bidi="ar-YE"/>
-        </w:rPr>
-      </w:pPr>
-    </w:p>
-    <w:p>
-      <w:pPr>
-        <w:bidi/>
-        <w:rPr>
-          <w:noProof/>
-        </w:rPr>
-      </w:pPr>
-      <w:r>
-        <w:rPr>
-          <w:noProof/>
-        </w:rPr>
-        <w:lastRenderedPageBreak/>
+          <w:noProof/>
+        </w:rPr>
+      </w:pPr>
+      <w:r>
+        <w:rPr>
+          <w:rFonts w:hint="cs"/>
+          <w:noProof/>
+          <w:rtl/>
+        </w:rPr>
+        <w:t>13-</w:t>
+      </w:r>
+      <w:r>
+        <w:rPr>
+          <w:rFonts w:hint="cs"/>
+          <w:noProof/>
+          <w:rtl/>
+        </w:rPr>
+        <w:t>انشاء ورفع ملف</w:t>
+      </w:r>
+      <w:r>
+        <w:rPr>
+          <w:noProof/>
+        </w:rPr>
+        <w:t>README</w:t>
+      </w:r>
+    </w:p>
+    <w:p>
+      <w:pPr>
+        <w:bidi/>
+        <w:rPr>
+          <w:noProof/>
+        </w:rPr>
+      </w:pPr>
+      <w:r>
+        <w:rPr>
+          <w:noProof/>
+        </w:rPr>
         <w:drawing>
-          <wp:inline distT="0" distB="0" distL="0" distR="0" wp14:anchorId="4B2E6098" wp14:editId="6A59255B">
+          <wp:inline distT="0" distB="0" distL="0" distR="0" wp14:anchorId="7A52303E" wp14:editId="23DFF180">
             <wp:extent cx="5943600" cy="3343275"/>
             <wp:effectExtent l="0" t="0" r="0" b="9525"/>
-            <wp:docPr id="25" name="صورة 25"/>
+            <wp:docPr id="24" name="صورة 24"/>
             <wp:cNvGraphicFramePr>
               <a:graphicFrameLocks xmlns:a="http://schemas.openxmlformats.org/drawingml/2006/main" noChangeAspect="1"/>
             </wp:cNvGraphicFramePr>
@@ -1401,36 +1350,28 @@
       <w:pPr>
         <w:bidi/>
         <w:rPr>
-          <w:noProof/>
-        </w:rPr>
-      </w:pPr>
-    </w:p>
-    <w:p>
-      <w:pPr>
-        <w:tabs>
-          <w:tab w:val="left" w:pos="3544"/>
-        </w:tabs>
-        <w:bidi/>
-        <w:rPr>
-          <w:noProof/>
-        </w:rPr>
-      </w:pPr>
-      <w:r>
-        <w:rPr>
-          <w:rtl/>
-          <w:lang w:bidi="ar-YE"/>
-        </w:rPr>
-        <w:tab/>
-      </w:r>
-      <w:r>
-        <w:rPr>
-          <w:noProof/>
-        </w:rPr>
+          <w:rtl/>
+          <w:lang w:bidi="ar-YE"/>
+        </w:rPr>
+      </w:pPr>
+    </w:p>
+    <w:p>
+      <w:pPr>
+        <w:bidi/>
+        <w:rPr>
+          <w:noProof/>
+        </w:rPr>
+      </w:pPr>
+      <w:r>
+        <w:rPr>
+          <w:noProof/>
+        </w:rPr>
+        <w:lastRenderedPageBreak/>
         <w:drawing>
-          <wp:inline distT="0" distB="0" distL="0" distR="0" wp14:anchorId="22A9054A" wp14:editId="5884B854">
+          <wp:inline distT="0" distB="0" distL="0" distR="0" wp14:anchorId="4B2E6098" wp14:editId="6A59255B">
             <wp:extent cx="5943600" cy="3343275"/>
             <wp:effectExtent l="0" t="0" r="0" b="9525"/>
-            <wp:docPr id="26" name="صورة 26"/>
+            <wp:docPr id="25" name="صورة 25"/>
             <wp:cNvGraphicFramePr>
               <a:graphicFrameLocks xmlns:a="http://schemas.openxmlformats.org/drawingml/2006/main" noChangeAspect="1"/>
             </wp:cNvGraphicFramePr>
@@ -1467,14 +1408,14 @@
       <w:pPr>
         <w:bidi/>
         <w:rPr>
-          <w:lang w:bidi="ar-YE"/>
+          <w:noProof/>
         </w:rPr>
       </w:pPr>
     </w:p>
     <w:p>
       <w:pPr>
         <w:tabs>
-          <w:tab w:val="left" w:pos="6611"/>
+          <w:tab w:val="left" w:pos="3544"/>
         </w:tabs>
         <w:bidi/>
         <w:rPr>
@@ -1486,7 +1427,6 @@
           <w:rtl/>
           <w:lang w:bidi="ar-YE"/>
         </w:rPr>
-        <w:lastRenderedPageBreak/>
         <w:tab/>
       </w:r>
       <w:r>
@@ -1494,10 +1434,10 @@
           <w:noProof/>
         </w:rPr>
         <w:drawing>
-          <wp:inline distT="0" distB="0" distL="0" distR="0" wp14:anchorId="5FAE89E9" wp14:editId="3308EF55">
+          <wp:inline distT="0" distB="0" distL="0" distR="0" wp14:anchorId="22A9054A" wp14:editId="5884B854">
             <wp:extent cx="5943600" cy="3343275"/>
             <wp:effectExtent l="0" t="0" r="0" b="9525"/>
-            <wp:docPr id="27" name="صورة 27"/>
+            <wp:docPr id="26" name="صورة 26"/>
             <wp:cNvGraphicFramePr>
               <a:graphicFrameLocks xmlns:a="http://schemas.openxmlformats.org/drawingml/2006/main" noChangeAspect="1"/>
             </wp:cNvGraphicFramePr>
@@ -1533,20 +1473,38 @@
     <w:p>
       <w:pPr>
         <w:bidi/>
-        <w:jc w:val="center"/>
-        <w:rPr>
-          <w:noProof/>
-        </w:rPr>
-      </w:pPr>
+        <w:rPr>
+          <w:lang w:bidi="ar-YE"/>
+        </w:rPr>
+      </w:pPr>
+    </w:p>
+    <w:p>
+      <w:pPr>
+        <w:tabs>
+          <w:tab w:val="left" w:pos="6611"/>
+        </w:tabs>
+        <w:bidi/>
+        <w:rPr>
+          <w:noProof/>
+        </w:rPr>
+      </w:pPr>
+      <w:r>
+        <w:rPr>
+          <w:rtl/>
+          <w:lang w:bidi="ar-YE"/>
+        </w:rPr>
+        <w:lastRenderedPageBreak/>
+        <w:tab/>
+      </w:r>
       <w:r>
         <w:rPr>
           <w:noProof/>
         </w:rPr>
         <w:drawing>
-          <wp:inline distT="0" distB="0" distL="0" distR="0" wp14:anchorId="4E0D8584" wp14:editId="5C14B4F0">
+          <wp:inline distT="0" distB="0" distL="0" distR="0" wp14:anchorId="5FAE89E9" wp14:editId="3308EF55">
             <wp:extent cx="5943600" cy="3343275"/>
             <wp:effectExtent l="0" t="0" r="0" b="9525"/>
-            <wp:docPr id="28" name="صورة 28"/>
+            <wp:docPr id="27" name="صورة 27"/>
             <wp:cNvGraphicFramePr>
               <a:graphicFrameLocks xmlns:a="http://schemas.openxmlformats.org/drawingml/2006/main" noChangeAspect="1"/>
             </wp:cNvGraphicFramePr>
@@ -1581,13 +1539,61 @@
     </w:p>
     <w:p>
       <w:pPr>
+        <w:bidi/>
+        <w:jc w:val="center"/>
+        <w:rPr>
+          <w:noProof/>
+        </w:rPr>
+      </w:pPr>
+      <w:r>
+        <w:rPr>
+          <w:noProof/>
+        </w:rPr>
+        <w:drawing>
+          <wp:inline distT="0" distB="0" distL="0" distR="0" wp14:anchorId="4E0D8584" wp14:editId="5C14B4F0">
+            <wp:extent cx="5943600" cy="3343275"/>
+            <wp:effectExtent l="0" t="0" r="0" b="9525"/>
+            <wp:docPr id="28" name="صورة 28"/>
+            <wp:cNvGraphicFramePr>
+              <a:graphicFrameLocks xmlns:a="http://schemas.openxmlformats.org/drawingml/2006/main" noChangeAspect="1"/>
+            </wp:cNvGraphicFramePr>
+            <a:graphic xmlns:a="http://schemas.openxmlformats.org/drawingml/2006/main">
+              <a:graphicData uri="http://schemas.openxmlformats.org/drawingml/2006/picture">
+                <pic:pic xmlns:pic="http://schemas.openxmlformats.org/drawingml/2006/picture">
+                  <pic:nvPicPr>
+                    <pic:cNvPr id="1" name=""/>
+                    <pic:cNvPicPr/>
+                  </pic:nvPicPr>
+                  <pic:blipFill>
+                    <a:blip r:embed="rId28"/>
+                    <a:stretch>
+                      <a:fillRect/>
+                    </a:stretch>
+                  </pic:blipFill>
+                  <pic:spPr>
+                    <a:xfrm>
+                      <a:off x="0" y="0"/>
+                      <a:ext cx="5943600" cy="3343275"/>
+                    </a:xfrm>
+                    <a:prstGeom prst="rect">
+                      <a:avLst/>
+                    </a:prstGeom>
+                  </pic:spPr>
+                </pic:pic>
+              </a:graphicData>
+            </a:graphic>
+          </wp:inline>
+        </w:drawing>
+      </w:r>
+    </w:p>
+    <w:p>
+      <w:pPr>
         <w:tabs>
           <w:tab w:val="left" w:pos="1889"/>
         </w:tabs>
         <w:bidi/>
         <w:rPr>
-          <w:rtl/>
-          <w:lang w:bidi="ar-YE"/>
+          <w:noProof/>
         </w:rPr>
       </w:pPr>
       <w:r>
@@ -1618,7 +1624,83 @@
                     <pic:cNvPicPr/>
                   </pic:nvPicPr>
                   <pic:blipFill>
-                    <a:blip r:embed="rId28"/>
+                    <a:blip r:embed="rId29"/>
+                    <a:stretch>
+                      <a:fillRect/>
+                    </a:stretch>
+                  </pic:blipFill>
+                  <pic:spPr>
+                    <a:xfrm>
+                      <a:off x="0" y="0"/>
+                      <a:ext cx="5943600" cy="3343275"/>
+                    </a:xfrm>
+                    <a:prstGeom prst="rect">
+                      <a:avLst/>
+                    </a:prstGeom>
+                  </pic:spPr>
+                </pic:pic>
+              </a:graphicData>
+            </a:graphic>
+          </wp:inline>
+        </w:drawing>
+      </w:r>
+    </w:p>
+    <w:p>
+      <w:pPr>
+        <w:bidi/>
+        <w:jc w:val="right"/>
+        <w:rPr>
+          <w:lang w:bidi="ar-YE"/>
+        </w:rPr>
+      </w:pPr>
+    </w:p>
+    <w:p>
+      <w:pPr>
+        <w:bidi/>
+        <w:rPr>
+          <w:rtl/>
+          <w:lang w:bidi="ar-YE"/>
+        </w:rPr>
+      </w:pPr>
+      <w:r>
+        <w:rPr>
+          <w:rFonts w:hint="cs"/>
+          <w:rtl/>
+          <w:lang w:bidi="ar-YE"/>
+        </w:rPr>
+        <w:t>14- اضافة ملف الصور ورفعه</w:t>
+      </w:r>
+    </w:p>
+    <w:p>
+      <w:pPr>
+        <w:bidi/>
+        <w:rPr>
+          <w:rFonts w:hint="cs"/>
+          <w:rtl/>
+          <w:lang w:bidi="ar-YE"/>
+        </w:rPr>
+      </w:pPr>
+      <w:r>
+        <w:rPr>
+          <w:noProof/>
+        </w:rPr>
+        <w:drawing>
+          <wp:inline distT="0" distB="0" distL="0" distR="0" wp14:anchorId="1A9B4A2B" wp14:editId="221A9700">
+            <wp:extent cx="5943600" cy="3343275"/>
+            <wp:effectExtent l="0" t="0" r="0" b="9525"/>
+            <wp:docPr id="2" name="صورة 2"/>
+            <wp:cNvGraphicFramePr>
+              <a:graphicFrameLocks xmlns:a="http://schemas.openxmlformats.org/drawingml/2006/main" noChangeAspect="1"/>
+            </wp:cNvGraphicFramePr>
+            <a:graphic xmlns:a="http://schemas.openxmlformats.org/drawingml/2006/main">
+              <a:graphicData uri="http://schemas.openxmlformats.org/drawingml/2006/picture">
+                <pic:pic xmlns:pic="http://schemas.openxmlformats.org/drawingml/2006/picture">
+                  <pic:nvPicPr>
+                    <pic:cNvPr id="1" name=""/>
+                    <pic:cNvPicPr/>
+                  </pic:nvPicPr>
+                  <pic:blipFill>
+                    <a:blip r:embed="rId30"/>
                     <a:stretch>
                       <a:fillRect/>
                     </a:stretch>
@@ -2465,4 +2547,16 @@
     </a:ext>
   </a:extLst>
 </a:theme>
+</file>
+
+<file path=customXml/item1.xml><?xml version="1.0" encoding="utf-8"?>
+<b:Sources xmlns:b="http://schemas.openxmlformats.org/officeDocument/2006/bibliography" xmlns="http://schemas.openxmlformats.org/officeDocument/2006/bibliography" SelectedStyle="\APASixthEditionOfficeOnline.xsl" StyleName="APA" Version="6"/>
+</file>
+
+<file path=customXml/itemProps1.xml><?xml version="1.0" encoding="utf-8"?>
+<ds:datastoreItem xmlns:ds="http://schemas.openxmlformats.org/officeDocument/2006/customXml" ds:itemID="{C848CBA0-EC1A-4C4D-BC8D-D87180FE78DE}">
+  <ds:schemaRefs>
+    <ds:schemaRef ds:uri="http://schemas.openxmlformats.org/officeDocument/2006/bibliography"/>
+  </ds:schemaRefs>
+</ds:datastoreItem>
 </file>
</xml_diff>